<commit_message>
test(fixtures): regenerate DOCX fixtures deterministically with full category set
</commit_message>
<xml_diff>
--- a/test-fixtures/docx/complex/text_and_table.docx
+++ b/test-fixtures/docx/complex/text_and_table.docx
@@ -1,28 +1,36 @@
 
 <file path=word/document.xml><?xml version="1.0" encoding="utf-8"?>
-<w:document xmlns:w="http://schemas.openxmlformats.org/wordprocessingml/2006/main">
+<w:document xmlns:w="http://schemas.openxmlformats.org/wordprocessingml/2006/main" xmlns:r="http://schemas.openxmlformats.org/officeDocument/2006/relationships" xmlns:wp="http://schemas.openxmlformats.org/drawingml/2006/wordprocessingDrawing" xmlns:a="http://schemas.openxmlformats.org/drawingml/2006/main" xmlns:pic="http://schemas.openxmlformats.org/drawingml/2006/picture" xmlns:mc="http://schemas.openxmlformats.org/markup-compatibility/2006" xmlns:wps="http://schemas.microsoft.com/office/word/2010/wordprocessingShape" xmlns:wpg="http://schemas.microsoft.com/office/word/2010/wordprocessingGroup" mc:Ignorable="w14 wp14 wps wpg mc">
   <w:body>
     <w:p>
       <w:r>
-        <w:t>Text before</w:t>
+        <w:t xml:space="preserve">Text before</w:t>
       </w:r>
     </w:p>
     <w:tbl>
       <w:tblPr>
         <w:tblW w:w="0" w:type="auto"/>
+        <w:tblBorders>
+          <w:top w:val="single" w:sz="4" w:space="0" w:color="auto"/>
+          <w:left w:val="single" w:sz="4" w:space="0" w:color="auto"/>
+          <w:bottom w:val="single" w:sz="4" w:space="0" w:color="auto"/>
+          <w:right w:val="single" w:sz="4" w:space="0" w:color="auto"/>
+          <w:insideH w:val="single" w:sz="4" w:space="0" w:color="auto"/>
+          <w:insideV w:val="single" w:sz="4" w:space="0" w:color="auto"/>
+        </w:tblBorders>
       </w:tblPr>
       <w:tr>
         <w:tc>
           <w:p>
             <w:r>
-              <w:t>H1</w:t>
+              <w:t xml:space="preserve">H1</w:t>
             </w:r>
           </w:p>
         </w:tc>
         <w:tc>
           <w:p>
             <w:r>
-              <w:t>H2</w:t>
+              <w:t xml:space="preserve">H2</w:t>
             </w:r>
           </w:p>
         </w:tc>
@@ -31,14 +39,14 @@
         <w:tc>
           <w:p>
             <w:r>
-              <w:t>C1</w:t>
+              <w:t xml:space="preserve">C1</w:t>
             </w:r>
           </w:p>
         </w:tc>
         <w:tc>
           <w:p>
             <w:r>
-              <w:t>C2</w:t>
+              <w:t xml:space="preserve">C2</w:t>
             </w:r>
           </w:p>
         </w:tc>
@@ -46,26 +54,141 @@
     </w:tbl>
     <w:p>
       <w:r>
-        <w:t>Text after</w:t>
+        <w:t xml:space="preserve">Text after</w:t>
       </w:r>
     </w:p>
+    <w:sectPr>
+      <w:pgSz w:w="11906" w:h="16838"/>
+      <w:pgMar w:top="1134" w:right="1134" w:bottom="1134" w:left="1134" w:header="709" w:footer="709" w:gutter="0"/>
+      <w:cols w:space="708"/>
+      <w:docGrid w:linePitch="360"/>
+    </w:sectPr>
   </w:body>
 </w:document>
 </file>
 
 <file path=word/styles.xml><?xml version="1.0" encoding="utf-8"?>
-<w:styles xmlns:w="http://schemas.openxmlformats.org/wordprocessingml/2006/main">
+<w:styles xmlns:w="http://schemas.openxmlformats.org/wordprocessingml/2006/main" xmlns:r="http://schemas.openxmlformats.org/officeDocument/2006/relationships">
   <w:docDefaults>
     <w:rPrDefault>
       <w:rPr>
-        <w:rFonts w:ascii="Calibri" w:hAnsi="Calibri"/>
+        <w:rFonts w:ascii="Calibri" w:hAnsi="Calibri" w:eastAsia="SimSun" w:cs="Arial"/>
+        <w:sz w:val="22"/>
+        <w:szCs w:val="22"/>
+        <w:lang w:val="en-US" w:eastAsia="zh-CN" w:bidi="ar-SA"/>
       </w:rPr>
     </w:rPrDefault>
     <w:pPrDefault>
       <w:pPr>
-        <w:spacing w:before="120" w:after="120"/>
+        <w:spacing w:before="0" w:after="160" w:line="259" w:lineRule="auto"/>
       </w:pPr>
     </w:pPrDefault>
   </w:docDefaults>
+  <w:style w:type="paragraph" w:default="1" w:styleId="Normal">
+    <w:name w:val="Normal"/>
+    <w:qFormat/>
+  </w:style>
+  <w:style w:type="character" w:default="1" w:styleId="DefaultParagraphFont">
+    <w:name w:val="Default Paragraph Font"/>
+    <w:uiPriority w:val="1"/>
+    <w:semiHidden/>
+    <w:unhideWhenUsed/>
+  </w:style>
+  <w:style w:type="table" w:default="1" w:styleId="TableNormal">
+    <w:name w:val="Normal Table"/>
+    <w:uiPriority w:val="99"/>
+    <w:semiHidden/>
+    <w:unhideWhenUsed/>
+  </w:style>
+  <w:style w:type="paragraph" w:styleId="Heading1">
+    <w:name w:val="Heading 1"/>
+    <w:basedOn w:val="Normal"/>
+    <w:next w:val="Normal"/>
+    <w:link w:val="Heading1Char"/>
+    <w:uiPriority w:val="9"/>
+    <w:qFormat/>
+    <w:pPr>
+      <w:keepNext/>
+      <w:keepLines/>
+      <w:spacing w:before="240" w:after="0"/>
+      <w:outlineLvl w:val="0"/>
+    </w:pPr>
+    <w:rPr>
+      <w:b/>
+      <w:color w:val="2f5496"/>
+      <w:sz w:val="32"/>
+    </w:rPr>
+  </w:style>
+  <w:style w:type="character" w:customStyle="1" w:styleId="Heading1Char">
+    <w:name w:val="Heading 1 Char"/>
+    <w:basedOn w:val="DefaultParagraphFont"/>
+    <w:link w:val="Heading1"/>
+    <w:uiPriority w:val="9"/>
+    <w:rPr>
+      <w:b/>
+      <w:color w:val="2f5496"/>
+      <w:sz w:val="32"/>
+    </w:rPr>
+  </w:style>
+  <w:style w:type="paragraph" w:styleId="Heading2">
+    <w:name w:val="Heading 2"/>
+    <w:basedOn w:val="Normal"/>
+    <w:next w:val="Normal"/>
+    <w:link w:val="Heading2Char"/>
+    <w:uiPriority w:val="9"/>
+    <w:qFormat/>
+    <w:pPr>
+      <w:keepNext/>
+      <w:keepLines/>
+      <w:spacing w:before="240" w:after="0"/>
+      <w:outlineLvl w:val="1"/>
+    </w:pPr>
+    <w:rPr>
+      <w:b/>
+      <w:color w:val="2f5496"/>
+      <w:sz w:val="26"/>
+    </w:rPr>
+  </w:style>
+  <w:style w:type="character" w:customStyle="1" w:styleId="Heading2Char">
+    <w:name w:val="Heading 2 Char"/>
+    <w:basedOn w:val="DefaultParagraphFont"/>
+    <w:link w:val="Heading2"/>
+    <w:uiPriority w:val="9"/>
+    <w:rPr>
+      <w:b/>
+      <w:color w:val="2f5496"/>
+      <w:sz w:val="26"/>
+    </w:rPr>
+  </w:style>
+  <w:style w:type="paragraph" w:styleId="Heading3">
+    <w:name w:val="Heading 3"/>
+    <w:basedOn w:val="Normal"/>
+    <w:next w:val="Normal"/>
+    <w:link w:val="Heading3Char"/>
+    <w:uiPriority w:val="9"/>
+    <w:qFormat/>
+    <w:pPr>
+      <w:keepNext/>
+      <w:keepLines/>
+      <w:spacing w:before="240" w:after="0"/>
+      <w:outlineLvl w:val="2"/>
+    </w:pPr>
+    <w:rPr>
+      <w:b/>
+      <w:color w:val="1f3763"/>
+      <w:sz w:val="24"/>
+    </w:rPr>
+  </w:style>
+  <w:style w:type="character" w:customStyle="1" w:styleId="Heading3Char">
+    <w:name w:val="Heading 3 Char"/>
+    <w:basedOn w:val="DefaultParagraphFont"/>
+    <w:link w:val="Heading3"/>
+    <w:uiPriority w:val="9"/>
+    <w:rPr>
+      <w:b/>
+      <w:color w:val="1f3763"/>
+      <w:sz w:val="24"/>
+    </w:rPr>
+  </w:style>
 </w:styles>
 </file>
</xml_diff>